<commit_message>
Daily portfolio docs refresh
</commit_message>
<xml_diff>
--- a/DESIGN.docx
+++ b/DESIGN.docx
@@ -53,7 +53,7 @@
           <w:sz w:val="22"/>
           <w:szCs w:val="22"/>
         </w:rPr>
-        <w:t>Generated 2026-08-08</w:t>
+        <w:t>Generated 2026-08-09</w:t>
       </w:r>
     </w:p>
     <w:p>
@@ -4435,7 +4435,7 @@
           <w:sz w:val="22"/>
           <w:szCs w:val="22"/>
         </w:rPr>
-        <w:t>Pytest wherever there is Python, with suites ranging from 7 tests (cert-manager) to ~4,210 (rfp-automation). It is not universal: prtg-import (PowerShell), outlook-followup (JS), kml, and the design-only fulcrum-replacement have no test suite at all</w:t>
+        <w:t>Pytest wherever there is Python, with suites ranging from 7 tests (cert-manager) to ~4,246 (rfp-automation). It is not universal: prtg-import (PowerShell), outlook-followup (JS), kml, and the design-only fulcrum-replacement have no test suite at all</w:t>
       </w:r>
     </w:p>
     <w:p>
@@ -8104,6 +8104,25 @@
           <w:sz w:val="22"/>
           <w:szCs w:val="22"/>
         </w:rPr>
+        <w:t>rfp-automation — decide on GovWin IntelliSearch ingest. It is wired into the watch loop as of 2026-08-08 but ships as a no-op, requiring both RFP_GOVWIN_INGEST_ENABLED and RFP_GOVWIN_INBOX_DIR plus a watcher restart (env loads once at process start) before it does anything.</w:t>
+      </w:r>
+    </w:p>
+    <w:p>
+      <w:pPr>
+        <w:pStyle w:val="ListParagraph"/>
+        <w:numPr>
+          <w:ilvl w:val="0"/>
+          <w:numId w:val="1"/>
+        </w:numPr>
+        <w:spacing w:after="40" w:before="40"/>
+      </w:pPr>
+      <w:r>
+        <w:rPr>
+          <w:rFonts w:ascii="Arial" w:cs="Arial" w:eastAsia="Arial" w:hAnsi="Arial"/>
+          <w:color w:val="1A1A1A"/>
+          <w:sz w:val="22"/>
+          <w:szCs w:val="22"/>
+        </w:rPr>
         <w:t>outlook-followup — fix or retire. Not the stub the registry called it (~1,300 LOC, real README, working webpack build), but not working either: its Graph half is dead because mailbox.js passes a callback to the promise-only Office.auth.getAccessToken, and storage.addItem() dedups on a conversationId that is null at compose time. Needs both defects fixed, a test suite, and a deployment call.</w:t>
       </w:r>
     </w:p>
@@ -8216,7 +8235,7 @@
           <w:sz w:val="22"/>
           <w:szCs w:val="22"/>
         </w:rPr>
-        <w:t>project-tracking — build the designed overnight portfolio digest (spec written 2026-08-07, not yet implemented); MS Project schedule diff UI; re-enable the EAC worksheet, which is built and API-backed but hidden behind SHOW_EAC_WORKSHEET = false with its e2e tests skipped to match. Sage-only ingestion completed its Phase 3 cutover 2026-08-07, retiring the funding/labor-PDF report pipeline; the now-unused pdfplumber dependency is still declared in pyproject.toml and can be dropped (per-job ACLs + sharing shipped June 2026; AR/AP cash position and invoice-level detail shipped August 2026).</w:t>
+        <w:t>project-tracking — build the designed overnight portfolio digest (spec written 2026-08-07, not yet implemented); MS Project schedule diff UI; re-enable the EAC worksheet, which is built and API-backed but hidden behind SHOW_EAC_WORKSHEET = false with its e2e tests skipped to match. Sage-only ingestion completed its Phase 3 cutover 2026-08-07, retiring the funding/labor-PDF report pipeline; the now-unused pdfplumber dependency is still declared in pyproject.toml and can be dropped. The weekly Executing Review went cache-backed 2026-08-08, prewarmed hourly by a fifth LaunchAgent (com.ssi.project-tracking-exec-sync), and open-PO commitment is now attributed down to the phase/CLIN via pchord.phsnum (per-job ACLs + sharing shipped June 2026; AR/AP cash position and invoice-level detail shipped August 2026).</w:t>
       </w:r>
     </w:p>
     <w:p>

</xml_diff>